<commit_message>
dodanie daigramu, poprawa dokumnetacji
</commit_message>
<xml_diff>
--- a/dokumentacja.docx
+++ b/dokumentacja.docx
@@ -1339,7 +1339,23 @@
           <w:szCs w:val="26"/>
           <w:lang w:val="en-US"/>
         </w:rPr>
-        <w:t>100,2) NOT NULL</w:t>
+        <w:t>1</w:t>
+      </w:r>
+      <w:r>
+        <w:rPr>
+          <w:sz w:val="26"/>
+          <w:szCs w:val="26"/>
+          <w:lang w:val="en-US"/>
+        </w:rPr>
+        <w:t>5</w:t>
+      </w:r>
+      <w:r>
+        <w:rPr>
+          <w:sz w:val="26"/>
+          <w:szCs w:val="26"/>
+          <w:lang w:val="en-US"/>
+        </w:rPr>
+        <w:t>,2) NOT NULL</w:t>
       </w:r>
     </w:p>
     <w:p>
@@ -2058,7 +2074,21 @@
           <w:sz w:val="26"/>
           <w:szCs w:val="26"/>
         </w:rPr>
-        <w:t>12,2) DEFAULT 0</w:t>
+        <w:t>1</w:t>
+      </w:r>
+      <w:r>
+        <w:rPr>
+          <w:sz w:val="26"/>
+          <w:szCs w:val="26"/>
+        </w:rPr>
+        <w:t>5</w:t>
+      </w:r>
+      <w:r>
+        <w:rPr>
+          <w:sz w:val="26"/>
+          <w:szCs w:val="26"/>
+        </w:rPr>
+        <w:t>,2) DEFAULT 0</w:t>
       </w:r>
     </w:p>
     <w:p>
@@ -2374,7 +2404,23 @@
           <w:szCs w:val="26"/>
           <w:lang w:val="en-US"/>
         </w:rPr>
-        <w:t>100,2) NOT NULL</w:t>
+        <w:t>1</w:t>
+      </w:r>
+      <w:r>
+        <w:rPr>
+          <w:sz w:val="26"/>
+          <w:szCs w:val="26"/>
+          <w:lang w:val="en-US"/>
+        </w:rPr>
+        <w:t>5</w:t>
+      </w:r>
+      <w:r>
+        <w:rPr>
+          <w:sz w:val="26"/>
+          <w:szCs w:val="26"/>
+          <w:lang w:val="en-US"/>
+        </w:rPr>
+        <w:t>,2) NOT NULL</w:t>
       </w:r>
     </w:p>
     <w:p>
@@ -2595,7 +2641,21 @@
           <w:sz w:val="26"/>
           <w:szCs w:val="26"/>
         </w:rPr>
-        <w:t>12,2) NOT NULL</w:t>
+        <w:t>1</w:t>
+      </w:r>
+      <w:r>
+        <w:rPr>
+          <w:sz w:val="26"/>
+          <w:szCs w:val="26"/>
+        </w:rPr>
+        <w:t>5</w:t>
+      </w:r>
+      <w:r>
+        <w:rPr>
+          <w:sz w:val="26"/>
+          <w:szCs w:val="26"/>
+        </w:rPr>
+        <w:t>,2) NOT NULL</w:t>
       </w:r>
     </w:p>
     <w:p>
@@ -2801,7 +2861,21 @@
           <w:sz w:val="26"/>
           <w:szCs w:val="26"/>
         </w:rPr>
-        <w:t>12,2)</w:t>
+        <w:t>1</w:t>
+      </w:r>
+      <w:r>
+        <w:rPr>
+          <w:sz w:val="26"/>
+          <w:szCs w:val="26"/>
+        </w:rPr>
+        <w:t>5</w:t>
+      </w:r>
+      <w:r>
+        <w:rPr>
+          <w:sz w:val="26"/>
+          <w:szCs w:val="26"/>
+        </w:rPr>
+        <w:t>,2)</w:t>
       </w:r>
     </w:p>
     <w:p>
@@ -2890,25 +2964,23 @@
           <w:szCs w:val="26"/>
           <w:lang w:val="en-US"/>
         </w:rPr>
-        <w:t xml:space="preserve"> </w:t>
-      </w:r>
-      <w:proofErr w:type="gramStart"/>
+        <w:t xml:space="preserve"> decimal(1</w:t>
+      </w:r>
       <w:r>
         <w:rPr>
           <w:sz w:val="26"/>
           <w:szCs w:val="26"/>
           <w:lang w:val="en-US"/>
         </w:rPr>
-        <w:t>decimal(</w:t>
-      </w:r>
-      <w:proofErr w:type="gramEnd"/>
+        <w:t>5</w:t>
+      </w:r>
       <w:r>
         <w:rPr>
           <w:sz w:val="26"/>
           <w:szCs w:val="26"/>
           <w:lang w:val="en-US"/>
         </w:rPr>
-        <w:t>100,2) NOT NULL</w:t>
+        <w:t>,2) NOT NULL</w:t>
       </w:r>
     </w:p>
     <w:p>

</xml_diff>